<commit_message>
fix: broaden injection detection for persona manipulation and data extraction
- Detect 'evil/malicious/rogue AI' persona without requiring 'now/actually'
- Add sensitive data extraction patterns (credentials, financial, personal data)
- Add authoritative directive detection ('you are to give me...')
- Rebuilds static demo page
</commit_message>
<xml_diff>
--- a/output/research_paper.docx
+++ b/output/research_paper.docx
@@ -31,7 +31,7 @@
           <w:rFonts w:ascii="Times New Roman" w:hAnsi="Times New Roman"/>
           <w:sz w:val="24"/>
         </w:rPr>
-        <w:t>Edward Research Group</w:t>
+        <w:t>Edward</w:t>
       </w:r>
     </w:p>
     <w:p>
@@ -44,6 +44,18 @@
           <w:sz w:val="24"/>
         </w:rPr>
         <w:t>Cybersecurity Research Division</w:t>
+      </w:r>
+    </w:p>
+    <w:p>
+      <w:pPr>
+        <w:jc w:val="center"/>
+      </w:pPr>
+      <w:r>
+        <w:rPr>
+          <w:rFonts w:ascii="Times New Roman" w:hAnsi="Times New Roman"/>
+          <w:sz w:val="24"/>
+        </w:rPr>
+        <w:t>Commonwealth Cyber Initiative</w:t>
       </w:r>
     </w:p>
     <w:p>
@@ -127,7 +139,7 @@
         <w:ind w:firstLine="720"/>
       </w:pPr>
       <w:r>
-        <w:t>The OWASP Foundation recognized prompt injection as the number one vulnerability in their 2025 Top 10 for Large Language Model Applications, reflecting the severity and prevalence of this threat. The National Institute of Standards and Technology (NIST) included prompt injection in their 2025 taxonomy of adversarial machine learning attacks, further validating its significance within the broader cybersecurity landscape. The attack surface has expanded dramatically with the proliferation of agentic AI systems that combine language models with tool-use capabilities, where a successful prompt injection can cascade from text manipulation to unauthorized code execution, data exfiltration, and system compromise.</w:t>
+        <w:t>The OWASP Foundation recognized prompt injection as the number one vulnerability in their 2025 Top 10 for Large Language Model Applications, reflecting the severity and prevalence of this threat (OWASP Foundation, 2025). The National Institute of Standards and Technology (NIST) included prompt injection in their 2025 taxonomy of adversarial machine learning attacks, further validating its significance within the broader cybersecurity landscape (NIST, 2025). The attack surface has expanded dramatically with the proliferation of agentic AI systems that combine language models with tool-use capabilities, where a successful prompt injection can cascade from text manipulation to unauthorized code execution, data exfiltration, and system compromise.</w:t>
       </w:r>
     </w:p>
     <w:p>
@@ -398,7 +410,7 @@
                     <pic:cNvPicPr/>
                   </pic:nvPicPr>
                   <pic:blipFill>
-                    <a:blip r:embed="rId9"/>
+                    <a:blip r:embed="rId10"/>
                     <a:stretch>
                       <a:fillRect/>
                     </a:stretch>
@@ -419,8 +431,23 @@
     </w:p>
     <w:p>
       <w:pPr>
+        <w:spacing w:before="120" w:after="0"/>
+        <w:ind w:firstLine="0"/>
+      </w:pPr>
+      <w:r>
+        <w:rPr>
+          <w:rFonts w:ascii="Times New Roman" w:hAnsi="Times New Roman"/>
+          <w:b/>
+          <w:i/>
+          <w:sz w:val="20"/>
+        </w:rPr>
+        <w:t>Figure 1</w:t>
+      </w:r>
+    </w:p>
+    <w:p>
+      <w:pPr>
         <w:spacing w:after="240"/>
-        <w:jc w:val="center"/>
+        <w:ind w:firstLine="0"/>
       </w:pPr>
       <w:r>
         <w:rPr>
@@ -428,7 +455,7 @@
           <w:i/>
           <w:sz w:val="20"/>
         </w:rPr>
-        <w:t>Figure 1. Hierarchical taxonomy of prompt injection attack vectors.</w:t>
+        <w:t>Hierarchical taxonomy of prompt injection attack vectors.</w:t>
       </w:r>
     </w:p>
     <w:p>
@@ -468,7 +495,7 @@
         <w:ind w:firstLine="720"/>
       </w:pPr>
       <w:r>
-        <w:t>Prompt injection can cause LLMs to leak sensitive information including system prompts, training data fragments, user personal data, and proprietary business logic. Indirect injection is particularly dangerous here because the exfiltration can occur without the user's awareness — for example, a poisoned document can instruct the AI assistant to encode confidential data into a URL that the model renders as a markdown image, triggering an HTTP request that transmits the data to an attacker-controlled server. OWASP ranks this among the highest-impact outcomes of LLM01 prompt injection.</w:t>
+        <w:t>Prompt injection can cause LLMs to leak sensitive information including system prompts, training data fragments, user personal data, and proprietary business logic. Indirect injection is particularly dangerous here because the exfiltration can occur without the user's awareness — for example, Greshake et al. (2023) demonstrated that a poisoned document can instruct an AI assistant to encode confidential data into a URL rendered as a markdown image, triggering an HTTP request that transmits the data to an attacker-controlled server. OWASP ranks this among the highest-impact outcomes of LLM01 prompt injection (OWASP Foundation, 2025).</w:t>
       </w:r>
     </w:p>
     <w:p>
@@ -476,7 +503,7 @@
         <w:ind w:firstLine="720"/>
       </w:pPr>
       <w:r>
-        <w:t>This risk category has been assessed as critical severity, affecting systems including AI assistants with access to personal data, RAG systems over confidential document stores. Documented examples include system prompt extraction from chatgpt custom gpts via 'repeat your instructions' attacks.</w:t>
+        <w:t>This risk category has been assessed as critical severity, affecting systems including AI assistants with access to personal data, RAG systems over confidential document stores, and code assistants with repository access. Willison (2024) has extensively documented real-world instances of system prompt extraction from ChatGPT custom GPTs via 'repeat your instructions' attacks.</w:t>
       </w:r>
     </w:p>
     <w:p>
@@ -492,7 +519,7 @@
         <w:ind w:firstLine="720"/>
       </w:pPr>
       <w:r>
-        <w:t>When LLMs are integrated with tools and APIs, prompt injection can cause the model to execute actions the user never intended — sending emails, modifying files, making purchases, or calling APIs with attacker-controlled parameters. Agentic AI systems with broad tool access are especially vulnerable because a single successful injection can cascade through multiple tool calls. The severity scales with the agent's permission scope: an agent with file system and network access poses fundamentally different risks than a text-only chatbot.</w:t>
+        <w:t>When LLMs are integrated with tools and APIs, prompt injection can cause the model to execute actions the user never intended — sending emails, modifying files, making purchases, or calling APIs with attacker-controlled parameters (Abdallah et al., 2025). Agentic AI systems with broad tool access are especially vulnerable because a single successful injection can cascade through multiple tool calls. The severity scales with the agent's permission scope: an agent with file system and network access poses fundamentally different risks than a text-only chatbot (OWASP Foundation, 2025).</w:t>
       </w:r>
     </w:p>
     <w:p>
@@ -500,7 +527,7 @@
         <w:ind w:firstLine="720"/>
       </w:pPr>
       <w:r>
-        <w:t>This risk category has been assessed as critical severity, affecting systems including AI agents with tool-use capabilities (MCP, function calling), Email and calendar AI assistants. Documented examples include ai email assistants sending messages to attacker-specified recipients via indirect injection.</w:t>
+        <w:t>This risk category has been assessed as critical severity, affecting systems including AI agents with tool-use capabilities (MCP, function calling) and email and calendar AI assistants. Documented examples include AI email assistants sending messages to attacker-specified recipients via indirect injection (Greshake et al., 2023).</w:t>
       </w:r>
     </w:p>
     <w:p>
@@ -516,7 +543,7 @@
         <w:ind w:firstLine="720"/>
       </w:pPr>
       <w:r>
-        <w:t>Attackers can use prompt injection to control, bias, or corrupt the model's output without detection by the end user. This includes generating disinformation, inserting propaganda into AI-generated summaries, biasing recommendations, or suppressing specific information. Content manipulation is particularly insidious because the user trusts the AI's output as objective, and the manipulated content appears identical in form to legitimate responses.</w:t>
+        <w:t>Attackers can use prompt injection to control, bias, or corrupt the model's output without detection by the end user. This includes generating disinformation, inserting propaganda into AI-generated summaries, biasing recommendations, or suppressing specific information (Yi et al., 2024). Content manipulation is particularly insidious because the user trusts the AI's output as objective, and the manipulated content appears identical in form to legitimate responses.</w:t>
       </w:r>
     </w:p>
     <w:p>
@@ -524,7 +551,7 @@
         <w:ind w:firstLine="720"/>
       </w:pPr>
       <w:r>
-        <w:t>This risk category has been assessed as high severity, affecting systems including AI-powered search and summarization tools, Content recommendation systems. Documented examples include indirect injection via web pages biasing bing chat responses about products or people.</w:t>
+        <w:t>This risk category has been assessed as high severity, affecting systems including AI-powered search and summarization tools. Greshake et al. (2023) documented how indirect injection via web pages could bias Bing Chat responses about products or people, while Willison (2024) has cataloged numerous content manipulation incidents across commercial LLM deployments.</w:t>
       </w:r>
     </w:p>
     <w:p>
@@ -540,7 +567,7 @@
         <w:ind w:firstLine="720"/>
       </w:pPr>
       <w:r>
-        <w:t>In agentic and tool-augmented deployments, prompt injection can escalate to full system compromise — arbitrary code execution, privilege escalation, or persistent backdoor installation. When AI agents have access to shell commands, file systems, or container orchestration, a successful injection effectively grants the attacker the same privileges as the agent process. This transforms prompt injection from an AI safety concern into a traditional cybersecurity vulnerability with potentially catastrophic consequences.</w:t>
+        <w:t>In agentic and tool-augmented deployments, prompt injection can escalate to full system compromise — arbitrary code execution, privilege escalation, or persistent backdoor installation (CrowdStrike, 2024). When AI agents have access to shell commands, file systems, or container orchestration, a successful injection effectively grants the attacker the same privileges as the agent process (Abdallah et al., 2025). This transforms prompt injection from an AI safety concern into a traditional cybersecurity vulnerability with potentially catastrophic consequences.</w:t>
       </w:r>
     </w:p>
     <w:p>
@@ -548,7 +575,7 @@
         <w:ind w:firstLine="720"/>
       </w:pPr>
       <w:r>
-        <w:t>This risk category has been assessed as critical severity, affecting systems including AI agents with code execution capabilities, DevOps and infrastructure automation agents. Documented examples include code execution through ai coding assistants processing malicious repository files.</w:t>
+        <w:t>This risk category has been assessed as critical severity, affecting systems including AI agents with code execution capabilities and DevOps automation agents. Documented examples include code execution through AI coding assistants processing malicious repository files (CrowdStrike, 2024).</w:t>
       </w:r>
     </w:p>
     <w:p>
@@ -564,7 +591,7 @@
         <w:ind w:firstLine="720"/>
       </w:pPr>
       <w:r>
-        <w:t>Prompt injection can propagate through AI supply chains, where the output of one compromised AI system becomes the input of another. This creates cascading failures across interconnected AI systems. Poisoned AI-generated content entering training data, knowledge bases, or shared document stores can perpetuate the attack across temporal and organizational boundaries. The Morris II AI worm concept demonstrates how self-replicating payloads could spread autonomously through networks of AI agents.</w:t>
+        <w:t>Prompt injection can propagate through AI supply chains, where the output of one compromised AI system becomes the input of another (Ahmed et al., 2025). This creates cascading failures across interconnected AI systems. Poisoned AI-generated content entering training data, knowledge bases, or shared document stores can perpetuate the attack across temporal and organizational boundaries. The Morris II AI worm concept demonstrates how self-replicating payloads could spread autonomously through networks of AI agents (Abdallah et al., 2025).</w:t>
       </w:r>
     </w:p>
     <w:p>
@@ -572,7 +599,7 @@
         <w:ind w:firstLine="720"/>
       </w:pPr>
       <w:r>
-        <w:t>This risk category has been assessed as high severity, affecting systems including Multi-agent AI architectures, AI-generated content pipelines. Documented examples include ai-generated code containing injection payloads committed to shared repositories.</w:t>
+        <w:t>This risk category has been assessed as high severity, affecting systems including multi-agent AI architectures and AI-generated content pipelines. Documented examples include AI-generated code containing injection payloads committed to shared repositories (BSG, 2025).</w:t>
       </w:r>
     </w:p>
     <w:p>
@@ -588,7 +615,7 @@
         <w:ind w:firstLine="720"/>
       </w:pPr>
       <w:r>
-        <w:t>Detecting prompt injection attacks remains a significant challenge due to the fundamental difficulty of distinguishing adversarial instructions from legitimate user input in natural language. Current detection approaches span a spectrum from simple pattern matching to sophisticated model-based evaluation, each with distinct tradeoffs between accuracy, latency, and robustness.</w:t>
+        <w:t>Detecting prompt injection attacks remains a significant challenge due to the fundamental difficulty of distinguishing adversarial instructions from legitimate user input in natural language. Current detection approaches span a spectrum from simple pattern matching to sophisticated model-based evaluation, each with distinct tradeoffs between accuracy, latency, and robustness (Abdallah et al., 2025).</w:t>
       </w:r>
     </w:p>
     <w:p>
@@ -612,7 +639,7 @@
         <w:ind w:firstLine="720"/>
       </w:pPr>
       <w:r>
-        <w:t>This static approach is exemplified by tools such as Rebuff heuristic layer — keyword and regex matching against known injection patterns. However, Easily evaded through synonym substitution, character-level obfuscation, or multi-language attacks. Cannot detect novel injection patterns not in the rule set. High maintenance burden as new attack patterns emerge continuously.</w:t>
+        <w:t>This static approach is exemplified by tools such as the Rebuff heuristic layer, which performs keyword and regex matching against known injection patterns (ProtectAI, 2023). However, these methods are easily evaded through synonym substitution, character-level obfuscation, or multi-language attacks. They cannot detect novel injection patterns outside the rule set, and the maintenance burden increases continuously as new attack patterns emerge (Schulhoff et al., 2023).</w:t>
       </w:r>
     </w:p>
     <w:p>
@@ -636,7 +663,7 @@
         <w:ind w:firstLine="720"/>
       </w:pPr>
       <w:r>
-        <w:t>This learned approach is exemplified by tools such as Rebuff vector similarity layer — cosine distance against known injection embeddings. However, Dependent on training data quality and coverage — novel attack patterns outside the training distribution are missed. Requires ongoing retraining as the attack landscape evolves. Embedding similarity approaches can be fooled by adversarial inputs optimized to be semantically distant from known attacks while remaining functionally equivalent.</w:t>
+        <w:t>This learned approach is exemplified by tools such as the Rebuff vector similarity layer (ProtectAI, 2023) and the Lakera Guard API, a commercial classifier trained on proprietary injection datasets (Lakera AI, 2024). Liu et al. (2024) provide formal benchmarking of these approaches, demonstrating that while ML classifiers achieve higher detection rates than heuristic methods for known patterns, they remain dependent on training data quality and coverage. Novel attack patterns outside the training distribution are consistently missed.</w:t>
       </w:r>
     </w:p>
     <w:p>
@@ -660,7 +687,7 @@
         <w:ind w:firstLine="720"/>
       </w:pPr>
       <w:r>
-        <w:t>This statistical approach is exemplified by tools such as Perplexity windowing — sliding window analysis flagging regions with anomalous scores. However, Effective primarily against machine-generated adversarial suffixes rather than human-crafted injection prompts, which tend to have natural perplexity. Requires calibration of thresholds per domain and language. Does not detect semantically valid injection prompts that are syntactically natural.</w:t>
+        <w:t>This statistical approach is exemplified by perplexity windowing — sliding window analysis that flags regions with anomalous scores (Alon &amp; Kamfonas, 2023). However, this method is effective primarily against machine-generated adversarial suffixes rather than human-crafted injection prompts, which tend to have natural perplexity. Calibration of thresholds per domain and language further limits generalizability.</w:t>
       </w:r>
     </w:p>
     <w:p>
@@ -684,7 +711,7 @@
         <w:ind w:firstLine="720"/>
       </w:pPr>
       <w:r>
-        <w:t>This proactive approach is exemplified by tools such as Rebuff canary token layer — random strings injected into system context and monitored in output. However, Only detects successful attacks that result in context leakage — does not prevent the injection itself. Canary tokens can be detected and filtered by sophisticated attackers who instruct the model to strip unusual strings from output. Limited to detecting prompt leaking; does not address goal hijacking or tool manipulation attacks.</w:t>
+        <w:t>This proactive approach is implemented in the Rebuff canary token layer (ProtectAI, 2023), which injects random strings into the system context and monitors outputs for their presence. However, canary tokens only detect successful attacks that result in context leakage — they do not prevent the injection itself. Sophisticated attackers can instruct the model to strip unusual strings from output, and the approach is limited to detecting prompt leaking rather than goal hijacking or tool manipulation (Abdallah et al., 2025).</w:t>
       </w:r>
     </w:p>
     <w:p>
@@ -708,8 +735,747 @@
         <w:ind w:firstLine="720"/>
       </w:pPr>
       <w:r>
-        <w:t>This model-based approach is exemplified by tools such as Rebuff LLM-based detection layer — GPT-4 prompt evaluating injection likelihood. However, Adds latency and cost from a second model inference per request. The judge model is itself susceptible to prompt injection — an attacker can craft inputs that fool both the primary and judge models simultaneously. Effectiveness degrades when the judge model is weaker than the primary model, as it cannot reliably detect attacks it would itself fall for.</w:t>
+        <w:t>This model-based approach is exemplified by the Rebuff LLM-based detection layer (ProtectAI, 2023) and dual-LLM architectures where a smaller model screens inputs before the primary model processes them (Abdallah et al., 2025). However, this adds latency and cost from a second model inference per request. The judge model is itself susceptible to prompt injection, and effectiveness degrades when the judge model is weaker than the primary model (Yi et al., 2024).</w:t>
       </w:r>
+    </w:p>
+    <w:p>
+      <w:pPr>
+        <w:spacing w:before="240" w:after="0"/>
+        <w:ind w:firstLine="0"/>
+      </w:pPr>
+      <w:r>
+        <w:rPr>
+          <w:rFonts w:ascii="Times New Roman" w:hAnsi="Times New Roman"/>
+          <w:b/>
+          <w:sz w:val="24"/>
+        </w:rPr>
+        <w:t>Table 1</w:t>
+      </w:r>
+    </w:p>
+    <w:p>
+      <w:pPr>
+        <w:spacing w:after="120"/>
+        <w:ind w:firstLine="0"/>
+      </w:pPr>
+      <w:r>
+        <w:rPr>
+          <w:rFonts w:ascii="Times New Roman" w:hAnsi="Times New Roman"/>
+          <w:i/>
+          <w:sz w:val="24"/>
+        </w:rPr>
+        <w:t>Comparison of Prompt Injection Detection Techniques</w:t>
+      </w:r>
+    </w:p>
+    <w:tbl>
+      <w:tblPr>
+        <w:tblW w:type="auto" w:w="0"/>
+        <w:tblLook w:firstColumn="1" w:firstRow="1" w:lastColumn="0" w:lastRow="0" w:noHBand="0" w:noVBand="1" w:val="04A0"/>
+        <w:tblBorders>
+          <w:top w:val="single" w:sz="4" w:space="0" w:color="000000"/>
+          <w:bottom w:val="single" w:sz="4" w:space="0" w:color="000000"/>
+          <w:left w:val="none" w:sz="0" w:space="0" w:color="000000"/>
+          <w:right w:val="none" w:sz="0" w:space="0" w:color="000000"/>
+          <w:insideV w:val="none" w:sz="0" w:space="0" w:color="000000"/>
+          <w:insideH w:val="none" w:sz="0" w:space="0" w:color="000000"/>
+        </w:tblBorders>
+      </w:tblPr>
+      <w:tblGrid>
+        <w:gridCol w:w="1560"/>
+        <w:gridCol w:w="1560"/>
+        <w:gridCol w:w="1560"/>
+        <w:gridCol w:w="1560"/>
+        <w:gridCol w:w="1560"/>
+        <w:gridCol w:w="1560"/>
+      </w:tblGrid>
+      <w:tr>
+        <w:tc>
+          <w:tcPr>
+            <w:tcW w:type="dxa" w:w="1560"/>
+            <w:tcBorders>
+              <w:bottom w:val="single" w:sz="4" w:space="0" w:color="000000"/>
+            </w:tcBorders>
+          </w:tcPr>
+          <w:p>
+            <w:pPr>
+              <w:spacing w:before="40" w:after="40"/>
+            </w:pPr>
+            <w:r/>
+            <w:r>
+              <w:rPr>
+                <w:rFonts w:ascii="Times New Roman" w:hAnsi="Times New Roman"/>
+                <w:b/>
+                <w:sz w:val="20"/>
+              </w:rPr>
+              <w:t>Technique</w:t>
+            </w:r>
+          </w:p>
+        </w:tc>
+        <w:tc>
+          <w:tcPr>
+            <w:tcW w:type="dxa" w:w="1560"/>
+            <w:tcBorders>
+              <w:bottom w:val="single" w:sz="4" w:space="0" w:color="000000"/>
+            </w:tcBorders>
+          </w:tcPr>
+          <w:p>
+            <w:pPr>
+              <w:spacing w:before="40" w:after="40"/>
+            </w:pPr>
+            <w:r/>
+            <w:r>
+              <w:rPr>
+                <w:rFonts w:ascii="Times New Roman" w:hAnsi="Times New Roman"/>
+                <w:b/>
+                <w:sz w:val="20"/>
+              </w:rPr>
+              <w:t>Type</w:t>
+            </w:r>
+          </w:p>
+        </w:tc>
+        <w:tc>
+          <w:tcPr>
+            <w:tcW w:type="dxa" w:w="1560"/>
+            <w:tcBorders>
+              <w:bottom w:val="single" w:sz="4" w:space="0" w:color="000000"/>
+            </w:tcBorders>
+          </w:tcPr>
+          <w:p>
+            <w:pPr>
+              <w:spacing w:before="40" w:after="40"/>
+            </w:pPr>
+            <w:r/>
+            <w:r>
+              <w:rPr>
+                <w:rFonts w:ascii="Times New Roman" w:hAnsi="Times New Roman"/>
+                <w:b/>
+                <w:sz w:val="20"/>
+              </w:rPr>
+              <w:t>Speed</w:t>
+            </w:r>
+          </w:p>
+        </w:tc>
+        <w:tc>
+          <w:tcPr>
+            <w:tcW w:type="dxa" w:w="1560"/>
+            <w:tcBorders>
+              <w:bottom w:val="single" w:sz="4" w:space="0" w:color="000000"/>
+            </w:tcBorders>
+          </w:tcPr>
+          <w:p>
+            <w:pPr>
+              <w:spacing w:before="40" w:after="40"/>
+            </w:pPr>
+            <w:r/>
+            <w:r>
+              <w:rPr>
+                <w:rFonts w:ascii="Times New Roman" w:hAnsi="Times New Roman"/>
+                <w:b/>
+                <w:sz w:val="20"/>
+              </w:rPr>
+              <w:t>Known Patterns</w:t>
+            </w:r>
+          </w:p>
+        </w:tc>
+        <w:tc>
+          <w:tcPr>
+            <w:tcW w:type="dxa" w:w="1560"/>
+            <w:tcBorders>
+              <w:bottom w:val="single" w:sz="4" w:space="0" w:color="000000"/>
+            </w:tcBorders>
+          </w:tcPr>
+          <w:p>
+            <w:pPr>
+              <w:spacing w:before="40" w:after="40"/>
+            </w:pPr>
+            <w:r/>
+            <w:r>
+              <w:rPr>
+                <w:rFonts w:ascii="Times New Roman" w:hAnsi="Times New Roman"/>
+                <w:b/>
+                <w:sz w:val="20"/>
+              </w:rPr>
+              <w:t>Novel Attacks</w:t>
+            </w:r>
+          </w:p>
+        </w:tc>
+        <w:tc>
+          <w:tcPr>
+            <w:tcW w:type="dxa" w:w="1560"/>
+            <w:tcBorders>
+              <w:bottom w:val="single" w:sz="4" w:space="0" w:color="000000"/>
+            </w:tcBorders>
+          </w:tcPr>
+          <w:p>
+            <w:pPr>
+              <w:spacing w:before="40" w:after="40"/>
+            </w:pPr>
+            <w:r/>
+            <w:r>
+              <w:rPr>
+                <w:rFonts w:ascii="Times New Roman" w:hAnsi="Times New Roman"/>
+                <w:b/>
+                <w:sz w:val="20"/>
+              </w:rPr>
+              <w:t>Key Limitation</w:t>
+            </w:r>
+          </w:p>
+        </w:tc>
+      </w:tr>
+      <w:tr>
+        <w:tc>
+          <w:tcPr>
+            <w:tcW w:type="dxa" w:w="1560"/>
+          </w:tcPr>
+          <w:p>
+            <w:pPr>
+              <w:spacing w:before="40" w:after="40"/>
+            </w:pPr>
+            <w:r/>
+            <w:r>
+              <w:rPr>
+                <w:rFonts w:ascii="Times New Roman" w:hAnsi="Times New Roman"/>
+                <w:sz w:val="20"/>
+              </w:rPr>
+              <w:t>Heuristic/Rule-Based</w:t>
+            </w:r>
+          </w:p>
+        </w:tc>
+        <w:tc>
+          <w:tcPr>
+            <w:tcW w:type="dxa" w:w="1560"/>
+          </w:tcPr>
+          <w:p>
+            <w:pPr>
+              <w:spacing w:before="40" w:after="40"/>
+            </w:pPr>
+            <w:r/>
+            <w:r>
+              <w:rPr>
+                <w:rFonts w:ascii="Times New Roman" w:hAnsi="Times New Roman"/>
+                <w:sz w:val="20"/>
+              </w:rPr>
+              <w:t>Static</w:t>
+            </w:r>
+          </w:p>
+        </w:tc>
+        <w:tc>
+          <w:tcPr>
+            <w:tcW w:type="dxa" w:w="1560"/>
+          </w:tcPr>
+          <w:p>
+            <w:pPr>
+              <w:spacing w:before="40" w:after="40"/>
+            </w:pPr>
+            <w:r/>
+            <w:r>
+              <w:rPr>
+                <w:rFonts w:ascii="Times New Roman" w:hAnsi="Times New Roman"/>
+                <w:sz w:val="20"/>
+              </w:rPr>
+              <w:t>High</w:t>
+            </w:r>
+          </w:p>
+        </w:tc>
+        <w:tc>
+          <w:tcPr>
+            <w:tcW w:type="dxa" w:w="1560"/>
+          </w:tcPr>
+          <w:p>
+            <w:pPr>
+              <w:spacing w:before="40" w:after="40"/>
+            </w:pPr>
+            <w:r/>
+            <w:r>
+              <w:rPr>
+                <w:rFonts w:ascii="Times New Roman" w:hAnsi="Times New Roman"/>
+                <w:sz w:val="20"/>
+              </w:rPr>
+              <w:t>Moderate</w:t>
+            </w:r>
+          </w:p>
+        </w:tc>
+        <w:tc>
+          <w:tcPr>
+            <w:tcW w:type="dxa" w:w="1560"/>
+          </w:tcPr>
+          <w:p>
+            <w:pPr>
+              <w:spacing w:before="40" w:after="40"/>
+            </w:pPr>
+            <w:r/>
+            <w:r>
+              <w:rPr>
+                <w:rFonts w:ascii="Times New Roman" w:hAnsi="Times New Roman"/>
+                <w:sz w:val="20"/>
+              </w:rPr>
+              <w:t>Low</w:t>
+            </w:r>
+          </w:p>
+        </w:tc>
+        <w:tc>
+          <w:tcPr>
+            <w:tcW w:type="dxa" w:w="1560"/>
+          </w:tcPr>
+          <w:p>
+            <w:pPr>
+              <w:spacing w:before="40" w:after="40"/>
+            </w:pPr>
+            <w:r/>
+            <w:r>
+              <w:rPr>
+                <w:rFonts w:ascii="Times New Roman" w:hAnsi="Times New Roman"/>
+                <w:sz w:val="20"/>
+              </w:rPr>
+              <w:t>Trivially bypassed via paraphrasing</w:t>
+            </w:r>
+          </w:p>
+        </w:tc>
+      </w:tr>
+      <w:tr>
+        <w:tc>
+          <w:tcPr>
+            <w:tcW w:type="dxa" w:w="1560"/>
+          </w:tcPr>
+          <w:p>
+            <w:pPr>
+              <w:spacing w:before="40" w:after="40"/>
+            </w:pPr>
+            <w:r/>
+            <w:r>
+              <w:rPr>
+                <w:rFonts w:ascii="Times New Roman" w:hAnsi="Times New Roman"/>
+                <w:sz w:val="20"/>
+              </w:rPr>
+              <w:t>ML Classification</w:t>
+            </w:r>
+          </w:p>
+        </w:tc>
+        <w:tc>
+          <w:tcPr>
+            <w:tcW w:type="dxa" w:w="1560"/>
+          </w:tcPr>
+          <w:p>
+            <w:pPr>
+              <w:spacing w:before="40" w:after="40"/>
+            </w:pPr>
+            <w:r/>
+            <w:r>
+              <w:rPr>
+                <w:rFonts w:ascii="Times New Roman" w:hAnsi="Times New Roman"/>
+                <w:sz w:val="20"/>
+              </w:rPr>
+              <w:t>Learned</w:t>
+            </w:r>
+          </w:p>
+        </w:tc>
+        <w:tc>
+          <w:tcPr>
+            <w:tcW w:type="dxa" w:w="1560"/>
+          </w:tcPr>
+          <w:p>
+            <w:pPr>
+              <w:spacing w:before="40" w:after="40"/>
+            </w:pPr>
+            <w:r/>
+            <w:r>
+              <w:rPr>
+                <w:rFonts w:ascii="Times New Roman" w:hAnsi="Times New Roman"/>
+                <w:sz w:val="20"/>
+              </w:rPr>
+              <w:t>Moderate</w:t>
+            </w:r>
+          </w:p>
+        </w:tc>
+        <w:tc>
+          <w:tcPr>
+            <w:tcW w:type="dxa" w:w="1560"/>
+          </w:tcPr>
+          <w:p>
+            <w:pPr>
+              <w:spacing w:before="40" w:after="40"/>
+            </w:pPr>
+            <w:r/>
+            <w:r>
+              <w:rPr>
+                <w:rFonts w:ascii="Times New Roman" w:hAnsi="Times New Roman"/>
+                <w:sz w:val="20"/>
+              </w:rPr>
+              <w:t>High</w:t>
+            </w:r>
+          </w:p>
+        </w:tc>
+        <w:tc>
+          <w:tcPr>
+            <w:tcW w:type="dxa" w:w="1560"/>
+          </w:tcPr>
+          <w:p>
+            <w:pPr>
+              <w:spacing w:before="40" w:after="40"/>
+            </w:pPr>
+            <w:r/>
+            <w:r>
+              <w:rPr>
+                <w:rFonts w:ascii="Times New Roman" w:hAnsi="Times New Roman"/>
+                <w:sz w:val="20"/>
+              </w:rPr>
+              <w:t>Low–Moderate</w:t>
+            </w:r>
+          </w:p>
+        </w:tc>
+        <w:tc>
+          <w:tcPr>
+            <w:tcW w:type="dxa" w:w="1560"/>
+          </w:tcPr>
+          <w:p>
+            <w:pPr>
+              <w:spacing w:before="40" w:after="40"/>
+            </w:pPr>
+            <w:r/>
+            <w:r>
+              <w:rPr>
+                <w:rFonts w:ascii="Times New Roman" w:hAnsi="Times New Roman"/>
+                <w:sz w:val="20"/>
+              </w:rPr>
+              <w:t>Training data dependent</w:t>
+            </w:r>
+          </w:p>
+        </w:tc>
+      </w:tr>
+      <w:tr>
+        <w:tc>
+          <w:tcPr>
+            <w:tcW w:type="dxa" w:w="1560"/>
+          </w:tcPr>
+          <w:p>
+            <w:pPr>
+              <w:spacing w:before="40" w:after="40"/>
+            </w:pPr>
+            <w:r/>
+            <w:r>
+              <w:rPr>
+                <w:rFonts w:ascii="Times New Roman" w:hAnsi="Times New Roman"/>
+                <w:sz w:val="20"/>
+              </w:rPr>
+              <w:t>Perplexity Analysis</w:t>
+            </w:r>
+          </w:p>
+        </w:tc>
+        <w:tc>
+          <w:tcPr>
+            <w:tcW w:type="dxa" w:w="1560"/>
+          </w:tcPr>
+          <w:p>
+            <w:pPr>
+              <w:spacing w:before="40" w:after="40"/>
+            </w:pPr>
+            <w:r/>
+            <w:r>
+              <w:rPr>
+                <w:rFonts w:ascii="Times New Roman" w:hAnsi="Times New Roman"/>
+                <w:sz w:val="20"/>
+              </w:rPr>
+              <w:t>Statistical</w:t>
+            </w:r>
+          </w:p>
+        </w:tc>
+        <w:tc>
+          <w:tcPr>
+            <w:tcW w:type="dxa" w:w="1560"/>
+          </w:tcPr>
+          <w:p>
+            <w:pPr>
+              <w:spacing w:before="40" w:after="40"/>
+            </w:pPr>
+            <w:r/>
+            <w:r>
+              <w:rPr>
+                <w:rFonts w:ascii="Times New Roman" w:hAnsi="Times New Roman"/>
+                <w:sz w:val="20"/>
+              </w:rPr>
+              <w:t>Moderate</w:t>
+            </w:r>
+          </w:p>
+        </w:tc>
+        <w:tc>
+          <w:tcPr>
+            <w:tcW w:type="dxa" w:w="1560"/>
+          </w:tcPr>
+          <w:p>
+            <w:pPr>
+              <w:spacing w:before="40" w:after="40"/>
+            </w:pPr>
+            <w:r/>
+            <w:r>
+              <w:rPr>
+                <w:rFonts w:ascii="Times New Roman" w:hAnsi="Times New Roman"/>
+                <w:sz w:val="20"/>
+              </w:rPr>
+              <w:t>Low</w:t>
+            </w:r>
+          </w:p>
+        </w:tc>
+        <w:tc>
+          <w:tcPr>
+            <w:tcW w:type="dxa" w:w="1560"/>
+          </w:tcPr>
+          <w:p>
+            <w:pPr>
+              <w:spacing w:before="40" w:after="40"/>
+            </w:pPr>
+            <w:r/>
+            <w:r>
+              <w:rPr>
+                <w:rFonts w:ascii="Times New Roman" w:hAnsi="Times New Roman"/>
+                <w:sz w:val="20"/>
+              </w:rPr>
+              <w:t>High (machine)</w:t>
+            </w:r>
+          </w:p>
+        </w:tc>
+        <w:tc>
+          <w:tcPr>
+            <w:tcW w:type="dxa" w:w="1560"/>
+          </w:tcPr>
+          <w:p>
+            <w:pPr>
+              <w:spacing w:before="40" w:after="40"/>
+            </w:pPr>
+            <w:r/>
+            <w:r>
+              <w:rPr>
+                <w:rFonts w:ascii="Times New Roman" w:hAnsi="Times New Roman"/>
+                <w:sz w:val="20"/>
+              </w:rPr>
+              <w:t>Ineffective on human-crafted</w:t>
+            </w:r>
+          </w:p>
+        </w:tc>
+      </w:tr>
+      <w:tr>
+        <w:tc>
+          <w:tcPr>
+            <w:tcW w:type="dxa" w:w="1560"/>
+          </w:tcPr>
+          <w:p>
+            <w:pPr>
+              <w:spacing w:before="40" w:after="40"/>
+            </w:pPr>
+            <w:r/>
+            <w:r>
+              <w:rPr>
+                <w:rFonts w:ascii="Times New Roman" w:hAnsi="Times New Roman"/>
+                <w:sz w:val="20"/>
+              </w:rPr>
+              <w:t>Canary Tokens</w:t>
+            </w:r>
+          </w:p>
+        </w:tc>
+        <w:tc>
+          <w:tcPr>
+            <w:tcW w:type="dxa" w:w="1560"/>
+          </w:tcPr>
+          <w:p>
+            <w:pPr>
+              <w:spacing w:before="40" w:after="40"/>
+            </w:pPr>
+            <w:r/>
+            <w:r>
+              <w:rPr>
+                <w:rFonts w:ascii="Times New Roman" w:hAnsi="Times New Roman"/>
+                <w:sz w:val="20"/>
+              </w:rPr>
+              <w:t>Proactive</w:t>
+            </w:r>
+          </w:p>
+        </w:tc>
+        <w:tc>
+          <w:tcPr>
+            <w:tcW w:type="dxa" w:w="1560"/>
+          </w:tcPr>
+          <w:p>
+            <w:pPr>
+              <w:spacing w:before="40" w:after="40"/>
+            </w:pPr>
+            <w:r/>
+            <w:r>
+              <w:rPr>
+                <w:rFonts w:ascii="Times New Roman" w:hAnsi="Times New Roman"/>
+                <w:sz w:val="20"/>
+              </w:rPr>
+              <w:t>High</w:t>
+            </w:r>
+          </w:p>
+        </w:tc>
+        <w:tc>
+          <w:tcPr>
+            <w:tcW w:type="dxa" w:w="1560"/>
+          </w:tcPr>
+          <w:p>
+            <w:pPr>
+              <w:spacing w:before="40" w:after="40"/>
+            </w:pPr>
+            <w:r/>
+            <w:r>
+              <w:rPr>
+                <w:rFonts w:ascii="Times New Roman" w:hAnsi="Times New Roman"/>
+                <w:sz w:val="20"/>
+              </w:rPr>
+              <w:t>N/A (post-hoc)</w:t>
+            </w:r>
+          </w:p>
+        </w:tc>
+        <w:tc>
+          <w:tcPr>
+            <w:tcW w:type="dxa" w:w="1560"/>
+          </w:tcPr>
+          <w:p>
+            <w:pPr>
+              <w:spacing w:before="40" w:after="40"/>
+            </w:pPr>
+            <w:r/>
+            <w:r>
+              <w:rPr>
+                <w:rFonts w:ascii="Times New Roman" w:hAnsi="Times New Roman"/>
+                <w:sz w:val="20"/>
+              </w:rPr>
+              <w:t>N/A</w:t>
+            </w:r>
+          </w:p>
+        </w:tc>
+        <w:tc>
+          <w:tcPr>
+            <w:tcW w:type="dxa" w:w="1560"/>
+          </w:tcPr>
+          <w:p>
+            <w:pPr>
+              <w:spacing w:before="40" w:after="40"/>
+            </w:pPr>
+            <w:r/>
+            <w:r>
+              <w:rPr>
+                <w:rFonts w:ascii="Times New Roman" w:hAnsi="Times New Roman"/>
+                <w:sz w:val="20"/>
+              </w:rPr>
+              <w:t>Only detects context leakage</w:t>
+            </w:r>
+          </w:p>
+        </w:tc>
+      </w:tr>
+      <w:tr>
+        <w:tc>
+          <w:tcPr>
+            <w:tcW w:type="dxa" w:w="1560"/>
+          </w:tcPr>
+          <w:p>
+            <w:pPr>
+              <w:spacing w:before="40" w:after="40"/>
+            </w:pPr>
+            <w:r/>
+            <w:r>
+              <w:rPr>
+                <w:rFonts w:ascii="Times New Roman" w:hAnsi="Times New Roman"/>
+                <w:sz w:val="20"/>
+              </w:rPr>
+              <w:t>LLM-as-Judge</w:t>
+            </w:r>
+          </w:p>
+        </w:tc>
+        <w:tc>
+          <w:tcPr>
+            <w:tcW w:type="dxa" w:w="1560"/>
+          </w:tcPr>
+          <w:p>
+            <w:pPr>
+              <w:spacing w:before="40" w:after="40"/>
+            </w:pPr>
+            <w:r/>
+            <w:r>
+              <w:rPr>
+                <w:rFonts w:ascii="Times New Roman" w:hAnsi="Times New Roman"/>
+                <w:sz w:val="20"/>
+              </w:rPr>
+              <w:t>Model-based</w:t>
+            </w:r>
+          </w:p>
+        </w:tc>
+        <w:tc>
+          <w:tcPr>
+            <w:tcW w:type="dxa" w:w="1560"/>
+          </w:tcPr>
+          <w:p>
+            <w:pPr>
+              <w:spacing w:before="40" w:after="40"/>
+            </w:pPr>
+            <w:r/>
+            <w:r>
+              <w:rPr>
+                <w:rFonts w:ascii="Times New Roman" w:hAnsi="Times New Roman"/>
+                <w:sz w:val="20"/>
+              </w:rPr>
+              <w:t>Low</w:t>
+            </w:r>
+          </w:p>
+        </w:tc>
+        <w:tc>
+          <w:tcPr>
+            <w:tcW w:type="dxa" w:w="1560"/>
+          </w:tcPr>
+          <w:p>
+            <w:pPr>
+              <w:spacing w:before="40" w:after="40"/>
+            </w:pPr>
+            <w:r/>
+            <w:r>
+              <w:rPr>
+                <w:rFonts w:ascii="Times New Roman" w:hAnsi="Times New Roman"/>
+                <w:sz w:val="20"/>
+              </w:rPr>
+              <w:t>High</w:t>
+            </w:r>
+          </w:p>
+        </w:tc>
+        <w:tc>
+          <w:tcPr>
+            <w:tcW w:type="dxa" w:w="1560"/>
+          </w:tcPr>
+          <w:p>
+            <w:pPr>
+              <w:spacing w:before="40" w:after="40"/>
+            </w:pPr>
+            <w:r/>
+            <w:r>
+              <w:rPr>
+                <w:rFonts w:ascii="Times New Roman" w:hAnsi="Times New Roman"/>
+                <w:sz w:val="20"/>
+              </w:rPr>
+              <w:t>Moderate–High</w:t>
+            </w:r>
+          </w:p>
+        </w:tc>
+        <w:tc>
+          <w:tcPr>
+            <w:tcW w:type="dxa" w:w="1560"/>
+          </w:tcPr>
+          <w:p>
+            <w:pPr>
+              <w:spacing w:before="40" w:after="40"/>
+            </w:pPr>
+            <w:r/>
+            <w:r>
+              <w:rPr>
+                <w:rFonts w:ascii="Times New Roman" w:hAnsi="Times New Roman"/>
+                <w:sz w:val="20"/>
+              </w:rPr>
+              <w:t>Costly; itself vulnerable</w:t>
+            </w:r>
+          </w:p>
+        </w:tc>
+      </w:tr>
+    </w:tbl>
+    <w:p>
+      <w:pPr>
+        <w:spacing w:before="120"/>
+      </w:pPr>
     </w:p>
     <w:p>
       <w:pPr>
@@ -731,7 +1497,7 @@
                     <pic:cNvPicPr/>
                   </pic:nvPicPr>
                   <pic:blipFill>
-                    <a:blip r:embed="rId10"/>
+                    <a:blip r:embed="rId11"/>
                     <a:stretch>
                       <a:fillRect/>
                     </a:stretch>
@@ -752,8 +1518,23 @@
     </w:p>
     <w:p>
       <w:pPr>
+        <w:spacing w:before="120" w:after="0"/>
+        <w:ind w:firstLine="0"/>
+      </w:pPr>
+      <w:r>
+        <w:rPr>
+          <w:rFonts w:ascii="Times New Roman" w:hAnsi="Times New Roman"/>
+          <w:b/>
+          <w:i/>
+          <w:sz w:val="20"/>
+        </w:rPr>
+        <w:t>Figure 2</w:t>
+      </w:r>
+    </w:p>
+    <w:p>
+      <w:pPr>
         <w:spacing w:after="240"/>
-        <w:jc w:val="center"/>
+        <w:ind w:firstLine="0"/>
       </w:pPr>
       <w:r>
         <w:rPr>
@@ -761,7 +1542,7 @@
           <w:i/>
           <w:sz w:val="20"/>
         </w:rPr>
-        <w:t>Figure 2. Detection and defense pipeline for prompt injection mitigation.</w:t>
+        <w:t>Detection and defense pipeline for prompt injection mitigation.</w:t>
       </w:r>
     </w:p>
     <w:p>
@@ -931,6 +1712,855 @@
       <w:r>
         <w:t>Operating at the system level, this strategy is implemented through approaches such as Dual-LLM pattern — quarantined model processes untrusted input, privileged model acts. Provides the strongest theoretical defense by removing the LLM from the critical execution path. However, these patterns significantly reduce the autonomy and capability that make LLM agents valuable. The fundamental tradeoff is between security and utility — the most secure system does the least. Adoption is limited by the complexity of implementing dual-model or human-in-the-loop architectures at scale.</w:t>
       </w:r>
+    </w:p>
+    <w:p>
+      <w:pPr>
+        <w:spacing w:before="240" w:after="0"/>
+        <w:ind w:firstLine="0"/>
+      </w:pPr>
+      <w:r>
+        <w:rPr>
+          <w:rFonts w:ascii="Times New Roman" w:hAnsi="Times New Roman"/>
+          <w:b/>
+          <w:sz w:val="24"/>
+        </w:rPr>
+        <w:t>Table 2</w:t>
+      </w:r>
+    </w:p>
+    <w:p>
+      <w:pPr>
+        <w:spacing w:after="120"/>
+        <w:ind w:firstLine="0"/>
+      </w:pPr>
+      <w:r>
+        <w:rPr>
+          <w:rFonts w:ascii="Times New Roman" w:hAnsi="Times New Roman"/>
+          <w:i/>
+          <w:sz w:val="24"/>
+        </w:rPr>
+        <w:t>Comparison of Prompt Injection Prevention Strategies</w:t>
+      </w:r>
+    </w:p>
+    <w:tbl>
+      <w:tblPr>
+        <w:tblW w:type="auto" w:w="0"/>
+        <w:tblLook w:firstColumn="1" w:firstRow="1" w:lastColumn="0" w:lastRow="0" w:noHBand="0" w:noVBand="1" w:val="04A0"/>
+        <w:tblBorders>
+          <w:top w:val="single" w:sz="4" w:space="0" w:color="000000"/>
+          <w:bottom w:val="single" w:sz="4" w:space="0" w:color="000000"/>
+          <w:left w:val="none" w:sz="0" w:space="0" w:color="000000"/>
+          <w:right w:val="none" w:sz="0" w:space="0" w:color="000000"/>
+          <w:insideV w:val="none" w:sz="0" w:space="0" w:color="000000"/>
+          <w:insideH w:val="none" w:sz="0" w:space="0" w:color="000000"/>
+        </w:tblBorders>
+      </w:tblPr>
+      <w:tblGrid>
+        <w:gridCol w:w="1560"/>
+        <w:gridCol w:w="1560"/>
+        <w:gridCol w:w="1560"/>
+        <w:gridCol w:w="1560"/>
+        <w:gridCol w:w="1560"/>
+        <w:gridCol w:w="1560"/>
+      </w:tblGrid>
+      <w:tr>
+        <w:tc>
+          <w:tcPr>
+            <w:tcW w:type="dxa" w:w="1560"/>
+            <w:tcBorders>
+              <w:bottom w:val="single" w:sz="4" w:space="0" w:color="000000"/>
+            </w:tcBorders>
+          </w:tcPr>
+          <w:p>
+            <w:pPr>
+              <w:spacing w:before="40" w:after="40"/>
+            </w:pPr>
+            <w:r/>
+            <w:r>
+              <w:rPr>
+                <w:rFonts w:ascii="Times New Roman" w:hAnsi="Times New Roman"/>
+                <w:b/>
+                <w:sz w:val="20"/>
+              </w:rPr>
+              <w:t>Strategy</w:t>
+            </w:r>
+          </w:p>
+        </w:tc>
+        <w:tc>
+          <w:tcPr>
+            <w:tcW w:type="dxa" w:w="1560"/>
+            <w:tcBorders>
+              <w:bottom w:val="single" w:sz="4" w:space="0" w:color="000000"/>
+            </w:tcBorders>
+          </w:tcPr>
+          <w:p>
+            <w:pPr>
+              <w:spacing w:before="40" w:after="40"/>
+            </w:pPr>
+            <w:r/>
+            <w:r>
+              <w:rPr>
+                <w:rFonts w:ascii="Times New Roman" w:hAnsi="Times New Roman"/>
+                <w:b/>
+                <w:sz w:val="20"/>
+              </w:rPr>
+              <w:t>Level</w:t>
+            </w:r>
+          </w:p>
+        </w:tc>
+        <w:tc>
+          <w:tcPr>
+            <w:tcW w:type="dxa" w:w="1560"/>
+            <w:tcBorders>
+              <w:bottom w:val="single" w:sz="4" w:space="0" w:color="000000"/>
+            </w:tcBorders>
+          </w:tcPr>
+          <w:p>
+            <w:pPr>
+              <w:spacing w:before="40" w:after="40"/>
+            </w:pPr>
+            <w:r/>
+            <w:r>
+              <w:rPr>
+                <w:rFonts w:ascii="Times New Roman" w:hAnsi="Times New Roman"/>
+                <w:b/>
+                <w:sz w:val="20"/>
+              </w:rPr>
+              <w:t>Prevents Injection</w:t>
+            </w:r>
+          </w:p>
+        </w:tc>
+        <w:tc>
+          <w:tcPr>
+            <w:tcW w:type="dxa" w:w="1560"/>
+            <w:tcBorders>
+              <w:bottom w:val="single" w:sz="4" w:space="0" w:color="000000"/>
+            </w:tcBorders>
+          </w:tcPr>
+          <w:p>
+            <w:pPr>
+              <w:spacing w:before="40" w:after="40"/>
+            </w:pPr>
+            <w:r/>
+            <w:r>
+              <w:rPr>
+                <w:rFonts w:ascii="Times New Roman" w:hAnsi="Times New Roman"/>
+                <w:b/>
+                <w:sz w:val="20"/>
+              </w:rPr>
+              <w:t>Limits Damage</w:t>
+            </w:r>
+          </w:p>
+        </w:tc>
+        <w:tc>
+          <w:tcPr>
+            <w:tcW w:type="dxa" w:w="1560"/>
+            <w:tcBorders>
+              <w:bottom w:val="single" w:sz="4" w:space="0" w:color="000000"/>
+            </w:tcBorders>
+          </w:tcPr>
+          <w:p>
+            <w:pPr>
+              <w:spacing w:before="40" w:after="40"/>
+            </w:pPr>
+            <w:r/>
+            <w:r>
+              <w:rPr>
+                <w:rFonts w:ascii="Times New Roman" w:hAnsi="Times New Roman"/>
+                <w:b/>
+                <w:sz w:val="20"/>
+              </w:rPr>
+              <w:t>Complexity</w:t>
+            </w:r>
+          </w:p>
+        </w:tc>
+        <w:tc>
+          <w:tcPr>
+            <w:tcW w:type="dxa" w:w="1560"/>
+            <w:tcBorders>
+              <w:bottom w:val="single" w:sz="4" w:space="0" w:color="000000"/>
+            </w:tcBorders>
+          </w:tcPr>
+          <w:p>
+            <w:pPr>
+              <w:spacing w:before="40" w:after="40"/>
+            </w:pPr>
+            <w:r/>
+            <w:r>
+              <w:rPr>
+                <w:rFonts w:ascii="Times New Roman" w:hAnsi="Times New Roman"/>
+                <w:b/>
+                <w:sz w:val="20"/>
+              </w:rPr>
+              <w:t>Coverage</w:t>
+            </w:r>
+          </w:p>
+        </w:tc>
+      </w:tr>
+      <w:tr>
+        <w:tc>
+          <w:tcPr>
+            <w:tcW w:type="dxa" w:w="1560"/>
+          </w:tcPr>
+          <w:p>
+            <w:pPr>
+              <w:spacing w:before="40" w:after="40"/>
+            </w:pPr>
+            <w:r/>
+            <w:r>
+              <w:rPr>
+                <w:rFonts w:ascii="Times New Roman" w:hAnsi="Times New Roman"/>
+                <w:sz w:val="20"/>
+              </w:rPr>
+              <w:t>Instruction Hierarchy</w:t>
+            </w:r>
+          </w:p>
+        </w:tc>
+        <w:tc>
+          <w:tcPr>
+            <w:tcW w:type="dxa" w:w="1560"/>
+          </w:tcPr>
+          <w:p>
+            <w:pPr>
+              <w:spacing w:before="40" w:after="40"/>
+            </w:pPr>
+            <w:r/>
+            <w:r>
+              <w:rPr>
+                <w:rFonts w:ascii="Times New Roman" w:hAnsi="Times New Roman"/>
+                <w:sz w:val="20"/>
+              </w:rPr>
+              <w:t>Model</w:t>
+            </w:r>
+          </w:p>
+        </w:tc>
+        <w:tc>
+          <w:tcPr>
+            <w:tcW w:type="dxa" w:w="1560"/>
+          </w:tcPr>
+          <w:p>
+            <w:pPr>
+              <w:spacing w:before="40" w:after="40"/>
+            </w:pPr>
+            <w:r/>
+            <w:r>
+              <w:rPr>
+                <w:rFonts w:ascii="Times New Roman" w:hAnsi="Times New Roman"/>
+                <w:sz w:val="20"/>
+              </w:rPr>
+              <w:t>High (direct)</w:t>
+            </w:r>
+          </w:p>
+        </w:tc>
+        <w:tc>
+          <w:tcPr>
+            <w:tcW w:type="dxa" w:w="1560"/>
+          </w:tcPr>
+          <w:p>
+            <w:pPr>
+              <w:spacing w:before="40" w:after="40"/>
+            </w:pPr>
+            <w:r/>
+            <w:r>
+              <w:rPr>
+                <w:rFonts w:ascii="Times New Roman" w:hAnsi="Times New Roman"/>
+                <w:sz w:val="20"/>
+              </w:rPr>
+              <w:t>N/A</w:t>
+            </w:r>
+          </w:p>
+        </w:tc>
+        <w:tc>
+          <w:tcPr>
+            <w:tcW w:type="dxa" w:w="1560"/>
+          </w:tcPr>
+          <w:p>
+            <w:pPr>
+              <w:spacing w:before="40" w:after="40"/>
+            </w:pPr>
+            <w:r/>
+            <w:r>
+              <w:rPr>
+                <w:rFonts w:ascii="Times New Roman" w:hAnsi="Times New Roman"/>
+                <w:sz w:val="20"/>
+              </w:rPr>
+              <w:t>High</w:t>
+            </w:r>
+          </w:p>
+        </w:tc>
+        <w:tc>
+          <w:tcPr>
+            <w:tcW w:type="dxa" w:w="1560"/>
+          </w:tcPr>
+          <w:p>
+            <w:pPr>
+              <w:spacing w:before="40" w:after="40"/>
+            </w:pPr>
+            <w:r/>
+            <w:r>
+              <w:rPr>
+                <w:rFonts w:ascii="Times New Roman" w:hAnsi="Times New Roman"/>
+                <w:sz w:val="20"/>
+              </w:rPr>
+              <w:t>Partial (indirect bypasses)</w:t>
+            </w:r>
+          </w:p>
+        </w:tc>
+      </w:tr>
+      <w:tr>
+        <w:tc>
+          <w:tcPr>
+            <w:tcW w:type="dxa" w:w="1560"/>
+          </w:tcPr>
+          <w:p>
+            <w:pPr>
+              <w:spacing w:before="40" w:after="40"/>
+            </w:pPr>
+            <w:r/>
+            <w:r>
+              <w:rPr>
+                <w:rFonts w:ascii="Times New Roman" w:hAnsi="Times New Roman"/>
+                <w:sz w:val="20"/>
+              </w:rPr>
+              <w:t>Input Sanitization</w:t>
+            </w:r>
+          </w:p>
+        </w:tc>
+        <w:tc>
+          <w:tcPr>
+            <w:tcW w:type="dxa" w:w="1560"/>
+          </w:tcPr>
+          <w:p>
+            <w:pPr>
+              <w:spacing w:before="40" w:after="40"/>
+            </w:pPr>
+            <w:r/>
+            <w:r>
+              <w:rPr>
+                <w:rFonts w:ascii="Times New Roman" w:hAnsi="Times New Roman"/>
+                <w:sz w:val="20"/>
+              </w:rPr>
+              <w:t>Application</w:t>
+            </w:r>
+          </w:p>
+        </w:tc>
+        <w:tc>
+          <w:tcPr>
+            <w:tcW w:type="dxa" w:w="1560"/>
+          </w:tcPr>
+          <w:p>
+            <w:pPr>
+              <w:spacing w:before="40" w:after="40"/>
+            </w:pPr>
+            <w:r/>
+            <w:r>
+              <w:rPr>
+                <w:rFonts w:ascii="Times New Roman" w:hAnsi="Times New Roman"/>
+                <w:sz w:val="20"/>
+              </w:rPr>
+              <w:t>Moderate</w:t>
+            </w:r>
+          </w:p>
+        </w:tc>
+        <w:tc>
+          <w:tcPr>
+            <w:tcW w:type="dxa" w:w="1560"/>
+          </w:tcPr>
+          <w:p>
+            <w:pPr>
+              <w:spacing w:before="40" w:after="40"/>
+            </w:pPr>
+            <w:r/>
+            <w:r>
+              <w:rPr>
+                <w:rFonts w:ascii="Times New Roman" w:hAnsi="Times New Roman"/>
+                <w:sz w:val="20"/>
+              </w:rPr>
+              <w:t>N/A</w:t>
+            </w:r>
+          </w:p>
+        </w:tc>
+        <w:tc>
+          <w:tcPr>
+            <w:tcW w:type="dxa" w:w="1560"/>
+          </w:tcPr>
+          <w:p>
+            <w:pPr>
+              <w:spacing w:before="40" w:after="40"/>
+            </w:pPr>
+            <w:r/>
+            <w:r>
+              <w:rPr>
+                <w:rFonts w:ascii="Times New Roman" w:hAnsi="Times New Roman"/>
+                <w:sz w:val="20"/>
+              </w:rPr>
+              <w:t>Low</w:t>
+            </w:r>
+          </w:p>
+        </w:tc>
+        <w:tc>
+          <w:tcPr>
+            <w:tcW w:type="dxa" w:w="1560"/>
+          </w:tcPr>
+          <w:p>
+            <w:pPr>
+              <w:spacing w:before="40" w:after="40"/>
+            </w:pPr>
+            <w:r/>
+            <w:r>
+              <w:rPr>
+                <w:rFonts w:ascii="Times New Roman" w:hAnsi="Times New Roman"/>
+                <w:sz w:val="20"/>
+              </w:rPr>
+              <w:t>Known patterns only</w:t>
+            </w:r>
+          </w:p>
+        </w:tc>
+      </w:tr>
+      <w:tr>
+        <w:tc>
+          <w:tcPr>
+            <w:tcW w:type="dxa" w:w="1560"/>
+          </w:tcPr>
+          <w:p>
+            <w:pPr>
+              <w:spacing w:before="40" w:after="40"/>
+            </w:pPr>
+            <w:r/>
+            <w:r>
+              <w:rPr>
+                <w:rFonts w:ascii="Times New Roman" w:hAnsi="Times New Roman"/>
+                <w:sz w:val="20"/>
+              </w:rPr>
+              <w:t>Output Validation</w:t>
+            </w:r>
+          </w:p>
+        </w:tc>
+        <w:tc>
+          <w:tcPr>
+            <w:tcW w:type="dxa" w:w="1560"/>
+          </w:tcPr>
+          <w:p>
+            <w:pPr>
+              <w:spacing w:before="40" w:after="40"/>
+            </w:pPr>
+            <w:r/>
+            <w:r>
+              <w:rPr>
+                <w:rFonts w:ascii="Times New Roman" w:hAnsi="Times New Roman"/>
+                <w:sz w:val="20"/>
+              </w:rPr>
+              <w:t>Application</w:t>
+            </w:r>
+          </w:p>
+        </w:tc>
+        <w:tc>
+          <w:tcPr>
+            <w:tcW w:type="dxa" w:w="1560"/>
+          </w:tcPr>
+          <w:p>
+            <w:pPr>
+              <w:spacing w:before="40" w:after="40"/>
+            </w:pPr>
+            <w:r/>
+            <w:r>
+              <w:rPr>
+                <w:rFonts w:ascii="Times New Roman" w:hAnsi="Times New Roman"/>
+                <w:sz w:val="20"/>
+              </w:rPr>
+              <w:t>N/A (post-hoc)</w:t>
+            </w:r>
+          </w:p>
+        </w:tc>
+        <w:tc>
+          <w:tcPr>
+            <w:tcW w:type="dxa" w:w="1560"/>
+          </w:tcPr>
+          <w:p>
+            <w:pPr>
+              <w:spacing w:before="40" w:after="40"/>
+            </w:pPr>
+            <w:r/>
+            <w:r>
+              <w:rPr>
+                <w:rFonts w:ascii="Times New Roman" w:hAnsi="Times New Roman"/>
+                <w:sz w:val="20"/>
+              </w:rPr>
+              <w:t>Moderate</w:t>
+            </w:r>
+          </w:p>
+        </w:tc>
+        <w:tc>
+          <w:tcPr>
+            <w:tcW w:type="dxa" w:w="1560"/>
+          </w:tcPr>
+          <w:p>
+            <w:pPr>
+              <w:spacing w:before="40" w:after="40"/>
+            </w:pPr>
+            <w:r/>
+            <w:r>
+              <w:rPr>
+                <w:rFonts w:ascii="Times New Roman" w:hAnsi="Times New Roman"/>
+                <w:sz w:val="20"/>
+              </w:rPr>
+              <w:t>Low</w:t>
+            </w:r>
+          </w:p>
+        </w:tc>
+        <w:tc>
+          <w:tcPr>
+            <w:tcW w:type="dxa" w:w="1560"/>
+          </w:tcPr>
+          <w:p>
+            <w:pPr>
+              <w:spacing w:before="40" w:after="40"/>
+            </w:pPr>
+            <w:r/>
+            <w:r>
+              <w:rPr>
+                <w:rFonts w:ascii="Times New Roman" w:hAnsi="Times New Roman"/>
+                <w:sz w:val="20"/>
+              </w:rPr>
+              <w:t>Observable violations</w:t>
+            </w:r>
+          </w:p>
+        </w:tc>
+      </w:tr>
+      <w:tr>
+        <w:tc>
+          <w:tcPr>
+            <w:tcW w:type="dxa" w:w="1560"/>
+          </w:tcPr>
+          <w:p>
+            <w:pPr>
+              <w:spacing w:before="40" w:after="40"/>
+            </w:pPr>
+            <w:r/>
+            <w:r>
+              <w:rPr>
+                <w:rFonts w:ascii="Times New Roman" w:hAnsi="Times New Roman"/>
+                <w:sz w:val="20"/>
+              </w:rPr>
+              <w:t>Sandboxing/Isolation</w:t>
+            </w:r>
+          </w:p>
+        </w:tc>
+        <w:tc>
+          <w:tcPr>
+            <w:tcW w:type="dxa" w:w="1560"/>
+          </w:tcPr>
+          <w:p>
+            <w:pPr>
+              <w:spacing w:before="40" w:after="40"/>
+            </w:pPr>
+            <w:r/>
+            <w:r>
+              <w:rPr>
+                <w:rFonts w:ascii="Times New Roman" w:hAnsi="Times New Roman"/>
+                <w:sz w:val="20"/>
+              </w:rPr>
+              <w:t>System</w:t>
+            </w:r>
+          </w:p>
+        </w:tc>
+        <w:tc>
+          <w:tcPr>
+            <w:tcW w:type="dxa" w:w="1560"/>
+          </w:tcPr>
+          <w:p>
+            <w:pPr>
+              <w:spacing w:before="40" w:after="40"/>
+            </w:pPr>
+            <w:r/>
+            <w:r>
+              <w:rPr>
+                <w:rFonts w:ascii="Times New Roman" w:hAnsi="Times New Roman"/>
+                <w:sz w:val="20"/>
+              </w:rPr>
+              <w:t>None</w:t>
+            </w:r>
+          </w:p>
+        </w:tc>
+        <w:tc>
+          <w:tcPr>
+            <w:tcW w:type="dxa" w:w="1560"/>
+          </w:tcPr>
+          <w:p>
+            <w:pPr>
+              <w:spacing w:before="40" w:after="40"/>
+            </w:pPr>
+            <w:r/>
+            <w:r>
+              <w:rPr>
+                <w:rFonts w:ascii="Times New Roman" w:hAnsi="Times New Roman"/>
+                <w:sz w:val="20"/>
+              </w:rPr>
+              <w:t>High</w:t>
+            </w:r>
+          </w:p>
+        </w:tc>
+        <w:tc>
+          <w:tcPr>
+            <w:tcW w:type="dxa" w:w="1560"/>
+          </w:tcPr>
+          <w:p>
+            <w:pPr>
+              <w:spacing w:before="40" w:after="40"/>
+            </w:pPr>
+            <w:r/>
+            <w:r>
+              <w:rPr>
+                <w:rFonts w:ascii="Times New Roman" w:hAnsi="Times New Roman"/>
+                <w:sz w:val="20"/>
+              </w:rPr>
+              <w:t>Moderate</w:t>
+            </w:r>
+          </w:p>
+        </w:tc>
+        <w:tc>
+          <w:tcPr>
+            <w:tcW w:type="dxa" w:w="1560"/>
+          </w:tcPr>
+          <w:p>
+            <w:pPr>
+              <w:spacing w:before="40" w:after="40"/>
+            </w:pPr>
+            <w:r/>
+            <w:r>
+              <w:rPr>
+                <w:rFonts w:ascii="Times New Roman" w:hAnsi="Times New Roman"/>
+                <w:sz w:val="20"/>
+              </w:rPr>
+              <w:t>Broad blast-radius control</w:t>
+            </w:r>
+          </w:p>
+        </w:tc>
+      </w:tr>
+      <w:tr>
+        <w:tc>
+          <w:tcPr>
+            <w:tcW w:type="dxa" w:w="1560"/>
+          </w:tcPr>
+          <w:p>
+            <w:pPr>
+              <w:spacing w:before="40" w:after="40"/>
+            </w:pPr>
+            <w:r/>
+            <w:r>
+              <w:rPr>
+                <w:rFonts w:ascii="Times New Roman" w:hAnsi="Times New Roman"/>
+                <w:sz w:val="20"/>
+              </w:rPr>
+              <w:t>Guardrail Frameworks</w:t>
+            </w:r>
+          </w:p>
+        </w:tc>
+        <w:tc>
+          <w:tcPr>
+            <w:tcW w:type="dxa" w:w="1560"/>
+          </w:tcPr>
+          <w:p>
+            <w:pPr>
+              <w:spacing w:before="40" w:after="40"/>
+            </w:pPr>
+            <w:r/>
+            <w:r>
+              <w:rPr>
+                <w:rFonts w:ascii="Times New Roman" w:hAnsi="Times New Roman"/>
+                <w:sz w:val="20"/>
+              </w:rPr>
+              <w:t>Application</w:t>
+            </w:r>
+          </w:p>
+        </w:tc>
+        <w:tc>
+          <w:tcPr>
+            <w:tcW w:type="dxa" w:w="1560"/>
+          </w:tcPr>
+          <w:p>
+            <w:pPr>
+              <w:spacing w:before="40" w:after="40"/>
+            </w:pPr>
+            <w:r/>
+            <w:r>
+              <w:rPr>
+                <w:rFonts w:ascii="Times New Roman" w:hAnsi="Times New Roman"/>
+                <w:sz w:val="20"/>
+              </w:rPr>
+              <w:t>Moderate</w:t>
+            </w:r>
+          </w:p>
+        </w:tc>
+        <w:tc>
+          <w:tcPr>
+            <w:tcW w:type="dxa" w:w="1560"/>
+          </w:tcPr>
+          <w:p>
+            <w:pPr>
+              <w:spacing w:before="40" w:after="40"/>
+            </w:pPr>
+            <w:r/>
+            <w:r>
+              <w:rPr>
+                <w:rFonts w:ascii="Times New Roman" w:hAnsi="Times New Roman"/>
+                <w:sz w:val="20"/>
+              </w:rPr>
+              <w:t>Moderate</w:t>
+            </w:r>
+          </w:p>
+        </w:tc>
+        <w:tc>
+          <w:tcPr>
+            <w:tcW w:type="dxa" w:w="1560"/>
+          </w:tcPr>
+          <w:p>
+            <w:pPr>
+              <w:spacing w:before="40" w:after="40"/>
+            </w:pPr>
+            <w:r/>
+            <w:r>
+              <w:rPr>
+                <w:rFonts w:ascii="Times New Roman" w:hAnsi="Times New Roman"/>
+                <w:sz w:val="20"/>
+              </w:rPr>
+              <w:t>Moderate</w:t>
+            </w:r>
+          </w:p>
+        </w:tc>
+        <w:tc>
+          <w:tcPr>
+            <w:tcW w:type="dxa" w:w="1560"/>
+          </w:tcPr>
+          <w:p>
+            <w:pPr>
+              <w:spacing w:before="40" w:after="40"/>
+            </w:pPr>
+            <w:r/>
+            <w:r>
+              <w:rPr>
+                <w:rFonts w:ascii="Times New Roman" w:hAnsi="Times New Roman"/>
+                <w:sz w:val="20"/>
+              </w:rPr>
+              <w:t>Configurable per app</w:t>
+            </w:r>
+          </w:p>
+        </w:tc>
+      </w:tr>
+      <w:tr>
+        <w:tc>
+          <w:tcPr>
+            <w:tcW w:type="dxa" w:w="1560"/>
+          </w:tcPr>
+          <w:p>
+            <w:pPr>
+              <w:spacing w:before="40" w:after="40"/>
+            </w:pPr>
+            <w:r/>
+            <w:r>
+              <w:rPr>
+                <w:rFonts w:ascii="Times New Roman" w:hAnsi="Times New Roman"/>
+                <w:sz w:val="20"/>
+              </w:rPr>
+              <w:t>Architectural Patterns</w:t>
+            </w:r>
+          </w:p>
+        </w:tc>
+        <w:tc>
+          <w:tcPr>
+            <w:tcW w:type="dxa" w:w="1560"/>
+          </w:tcPr>
+          <w:p>
+            <w:pPr>
+              <w:spacing w:before="40" w:after="40"/>
+            </w:pPr>
+            <w:r/>
+            <w:r>
+              <w:rPr>
+                <w:rFonts w:ascii="Times New Roman" w:hAnsi="Times New Roman"/>
+                <w:sz w:val="20"/>
+              </w:rPr>
+              <w:t>System</w:t>
+            </w:r>
+          </w:p>
+        </w:tc>
+        <w:tc>
+          <w:tcPr>
+            <w:tcW w:type="dxa" w:w="1560"/>
+          </w:tcPr>
+          <w:p>
+            <w:pPr>
+              <w:spacing w:before="40" w:after="40"/>
+            </w:pPr>
+            <w:r/>
+            <w:r>
+              <w:rPr>
+                <w:rFonts w:ascii="Times New Roman" w:hAnsi="Times New Roman"/>
+                <w:sz w:val="20"/>
+              </w:rPr>
+              <w:t>High (theoretical)</w:t>
+            </w:r>
+          </w:p>
+        </w:tc>
+        <w:tc>
+          <w:tcPr>
+            <w:tcW w:type="dxa" w:w="1560"/>
+          </w:tcPr>
+          <w:p>
+            <w:pPr>
+              <w:spacing w:before="40" w:after="40"/>
+            </w:pPr>
+            <w:r/>
+            <w:r>
+              <w:rPr>
+                <w:rFonts w:ascii="Times New Roman" w:hAnsi="Times New Roman"/>
+                <w:sz w:val="20"/>
+              </w:rPr>
+              <w:t>High</w:t>
+            </w:r>
+          </w:p>
+        </w:tc>
+        <w:tc>
+          <w:tcPr>
+            <w:tcW w:type="dxa" w:w="1560"/>
+          </w:tcPr>
+          <w:p>
+            <w:pPr>
+              <w:spacing w:before="40" w:after="40"/>
+            </w:pPr>
+            <w:r/>
+            <w:r>
+              <w:rPr>
+                <w:rFonts w:ascii="Times New Roman" w:hAnsi="Times New Roman"/>
+                <w:sz w:val="20"/>
+              </w:rPr>
+              <w:t>High</w:t>
+            </w:r>
+          </w:p>
+        </w:tc>
+        <w:tc>
+          <w:tcPr>
+            <w:tcW w:type="dxa" w:w="1560"/>
+          </w:tcPr>
+          <w:p>
+            <w:pPr>
+              <w:spacing w:before="40" w:after="40"/>
+            </w:pPr>
+            <w:r/>
+            <w:r>
+              <w:rPr>
+                <w:rFonts w:ascii="Times New Roman" w:hAnsi="Times New Roman"/>
+                <w:sz w:val="20"/>
+              </w:rPr>
+              <w:t>Broad but reduces utility</w:t>
+            </w:r>
+          </w:p>
+        </w:tc>
+      </w:tr>
+    </w:tbl>
+    <w:p>
+      <w:pPr>
+        <w:spacing w:before="120"/>
+      </w:pPr>
     </w:p>
     <w:p>
       <w:pPr>
@@ -952,7 +2582,7 @@
                     <pic:cNvPicPr/>
                   </pic:nvPicPr>
                   <pic:blipFill>
-                    <a:blip r:embed="rId11"/>
+                    <a:blip r:embed="rId12"/>
                     <a:stretch>
                       <a:fillRect/>
                     </a:stretch>
@@ -973,8 +2603,23 @@
     </w:p>
     <w:p>
       <w:pPr>
+        <w:spacing w:before="120" w:after="0"/>
+        <w:ind w:firstLine="0"/>
+      </w:pPr>
+      <w:r>
+        <w:rPr>
+          <w:rFonts w:ascii="Times New Roman" w:hAnsi="Times New Roman"/>
+          <w:b/>
+          <w:i/>
+          <w:sz w:val="20"/>
+        </w:rPr>
+        <w:t>Figure 3</w:t>
+      </w:r>
+    </w:p>
+    <w:p>
+      <w:pPr>
         <w:spacing w:after="240"/>
-        <w:jc w:val="center"/>
+        <w:ind w:firstLine="0"/>
       </w:pPr>
       <w:r>
         <w:rPr>
@@ -982,7 +2627,7 @@
           <w:i/>
           <w:sz w:val="20"/>
         </w:rPr>
-        <w:t>Figure 3. System architecture for layered prompt injection defense.</w:t>
+        <w:t>System architecture for layered prompt injection defense.</w:t>
       </w:r>
     </w:p>
     <w:p>
@@ -1046,7 +2691,7 @@
         <w:ind w:firstLine="720"/>
       </w:pPr>
       <w:r>
-        <w:t>The synthesis of findings across the four pillars reveals several critical insights about the current state of prompt injection as a cybersecurity threat. First, the attack taxonomy demonstrates a clear trajectory of increasing sophistication — from simple direct injection techniques that emerged in 2022 to complex autonomous propagating threats documented in 2024-2025. This evolution parallels the expansion of LLM capabilities, particularly the addition of tool use, web browsing, and multi-agent orchestration that dramatically increase the attack surface.</w:t>
+        <w:t>The synthesis of findings reveals that the evolution of prompt injection directly mirrors the expansion of LLM capabilities. As language models gained tool-use, web browsing, and multi-agent orchestration capabilities between 2022 and 2025, the attack taxonomy expanded correspondingly — from simple direct injection techniques to the autonomous propagating threats documented by Ahmed et al. (2025). This co-evolution is not coincidental; each new capability creates a new attack surface that adversaries rapidly exploit. The trajectory suggests that future LLM capabilities will inevitably introduce novel injection vectors, making static defense approaches fundamentally insufficient.</w:t>
       </w:r>
     </w:p>
     <w:p>
@@ -1054,7 +2699,7 @@
         <w:ind w:firstLine="720"/>
       </w:pPr>
       <w:r>
-        <w:t>Second, the risk analysis reveals that prompt injection has crossed the threshold from a theoretical AI safety concern to a practical cybersecurity vulnerability with real-world impact. The ability to cause data exfiltration, unauthorized actions, and system compromise through prompt injection places it alongside traditional vulnerability classes such as SQL injection and cross-site scripting — but with the added complexity that the vulnerability exists in natural language processing rather than structured data parsing.</w:t>
+        <w:t>The relationship between detection limitations and risk severity warrants particular attention. Current detection architectures — even multi-layered approaches combining heuristic, ML-based, and LLM-as-judge methods — face a structural disadvantage: novel injection techniques can be crafted more quickly than detection systems can adapt (Abdallah et al., 2025). This asymmetry directly enables the most severe risk categories. Data exfiltration through markdown image encoding (Greshake et al., 2023) and unauthorized tool invocation through indirect injection (OWASP Foundation, 2025) succeed precisely because they exploit gaps between detection layers. The parallel to the antivirus industry's evolution from signature-based to behavioral detection is instructive — the prompt injection field appears to be in its signature-based era, where reactive detection provides inadequate security against motivated adversaries.</w:t>
       </w:r>
     </w:p>
     <w:p>
@@ -1062,7 +2707,7 @@
         <w:ind w:firstLine="720"/>
       </w:pPr>
       <w:r>
-        <w:t>Third, the detection landscape shows promising but insufficient progress. While multi-layered detection architectures combining heuristic, ML-based, and LLM-as-judge approaches achieve reasonable detection rates for known attack patterns, the fundamental challenge remains: novel injection techniques can be constructed more quickly than detection systems can adapt. The analogy to the antivirus industry's signature-based detection era is instructive — reactive detection alone cannot provide adequate security against a motivated adversary.</w:t>
+        <w:t>Prevention strategy analysis reveals a fundamental tension between security and utility that divides responsibility across stakeholders. The instruction hierarchy approach (Wallace et al., 2024) represents the most theoretically sound defense, as it addresses the root cause — the inability to distinguish instruction privilege levels — at the model architecture level. However, this approach is exclusively available to model providers, leaving application developers reliant on input sanitization, guardrail frameworks, and output validation as their primary defenses. System architects can complement these with sandboxing and least-privilege patterns that limit blast radius, but at the cost of reduced LLM autonomy. This three-tier division — model providers handling instruction hierarchy, developers deploying guardrails, and architects enforcing isolation — represents the emerging consensus on defense allocation.</w:t>
       </w:r>
     </w:p>
     <w:p>
@@ -1070,7 +2715,7 @@
         <w:ind w:firstLine="720"/>
       </w:pPr>
       <w:r>
-        <w:t>Fourth, the prevention strategy assessment suggests that no single defense mechanism is sufficient. The instruction hierarchy approach (Wallace et al., 2024) represents the most theoretically promising model-level defense, but it requires training-time modifications that are unavailable to application developers. Application-level controls such as input sanitization and guardrail frameworks provide practical defense-in-depth but cannot guarantee complete protection. System-level architectural patterns offer the strongest containment through sandboxing and privilege restriction, but at the cost of reduced LLM autonomy and capability.</w:t>
+        <w:t>The supply chain and propagation risks compound these defensive challenges. The Morris II AI worm concept demonstrates that prompt injection is not merely a point vulnerability but a potential vector for systemic cascading failure across interconnected AI systems. When the output of a compromised model becomes input to another — through shared knowledge bases, AI-generated code repositories, or multi-agent workflows — a single injection can propagate beyond organizational boundaries (Ahmed et al., 2025). This systemic risk dimension distinguishes prompt injection from traditional web application vulnerabilities and demands architectural defenses, particularly the dual-LLM pattern and human-in-the-loop confirmation, despite their impact on system autonomy.</w:t>
       </w:r>
     </w:p>
     <w:p>
@@ -1078,7 +2723,7 @@
         <w:ind w:firstLine="720"/>
       </w:pPr>
       <w:r>
-        <w:t>The implications for practitioners are clear: organizations deploying LLM-integrated systems must adopt defense-in-depth strategies that combine multiple prevention layers rather than relying on any single mitigation. The principle of least privilege should govern all tool access granted to LLM agents. Human-in-the-loop confirmation should be required for irreversible or high-impact operations. And security teams should treat prompt injection with the same rigor applied to traditional web application vulnerabilities, including regular testing, monitoring, and incident response planning.</w:t>
+        <w:t>The implications for practitioners are clear: organizations deploying LLM-integrated systems must adopt layered defense strategies that combine multiple prevention mechanisms rather than relying on any single mitigation. The principle of least privilege should govern all tool access granted to LLM agents. Human-in-the-loop confirmation should be required for irreversible or high-impact operations. Security teams should treat prompt injection with the same rigor applied to traditional web application vulnerabilities — including penetration testing against injection vectors, continuous monitoring for anomalous model behavior, and incident response planning that accounts for the unique characteristics of AI-mediated attacks.</w:t>
       </w:r>
     </w:p>
     <w:p>
@@ -1118,7 +2763,7 @@
         <w:ind w:firstLine="720"/>
       </w:pPr>
       <w:r>
-        <w:t>Future research directions include the development of formal verification methods for LLM instruction compliance, standardized benchmarks for evaluating prompt injection defenses, and architectural innovations that create genuine separation between instruction and data processing pathways. Until such advances materialize, the cybersecurity community must treat prompt injection as a persistent threat requiring continuous monitoring, testing, and adaptive defense strategies.</w:t>
+        <w:t>Future research directions include the development of formal verification methods for LLM instruction compliance, as preliminary work by Liu et al. (2024) on benchmarking suggests that standardized evaluation frameworks are both feasible and urgently needed. The dual-LLM architectural pattern warrants further investigation as a practical defense for production deployments, particularly in establishing the optimal relationship between quarantined and privileged models. Additionally, the extension of instruction hierarchy training (Wallace et al., 2024) to handle indirect injection through trusted data channels remains a critical open problem. Until such advances materialize, the cybersecurity community must treat prompt injection as a persistent threat requiring continuous monitoring, testing, and adaptive defense strategies.</w:t>
       </w:r>
     </w:p>
     <w:p>
@@ -1297,6 +2942,7 @@
       </w:r>
     </w:p>
     <w:sectPr>
+      <w:headerReference w:type="default" r:id="rId9"/>
       <w:pgSz w:w="12240" w:h="15840"/>
       <w:pgMar w:top="1440" w:right="1440" w:bottom="1440" w:left="1440" w:header="720" w:footer="720" w:gutter="0"/>
       <w:cols w:space="720"/>
@@ -1304,6 +2950,27 @@
     </w:sectPr>
   </w:body>
 </w:document>
+</file>
+
+<file path=word/header1.xml><?xml version="1.0" encoding="utf-8"?>
+<w:hdr xmlns:m="http://schemas.openxmlformats.org/officeDocument/2006/math" xmlns:mc="http://schemas.openxmlformats.org/markup-compatibility/2006" xmlns:mo="http://schemas.microsoft.com/office/mac/office/2008/main" xmlns:mv="urn:schemas-microsoft-com:mac:vml" xmlns:o="urn:schemas-microsoft-com:office:office" xmlns:r="http://schemas.openxmlformats.org/officeDocument/2006/relationships" xmlns:v="urn:schemas-microsoft-com:vml" xmlns:w10="urn:schemas-microsoft-com:office:word" xmlns:w14="http://schemas.microsoft.com/office/word/2010/wordml" xmlns:w="http://schemas.openxmlformats.org/wordprocessingml/2006/main" xmlns:wne="http://schemas.microsoft.com/office/word/2006/wordml" xmlns:wp14="http://schemas.microsoft.com/office/word/2010/wordprocessingDrawing" xmlns:wp="http://schemas.openxmlformats.org/drawingml/2006/wordprocessingDrawing" xmlns:wpc="http://schemas.microsoft.com/office/word/2010/wordprocessingCanvas" xmlns:wpg="http://schemas.microsoft.com/office/word/2010/wordprocessingGroup" xmlns:wpi="http://schemas.microsoft.com/office/word/2010/wordprocessingInk" xmlns:wps="http://schemas.microsoft.com/office/word/2010/wordprocessingShape" mc:Ignorable="w14 wp14">
+  <w:p>
+    <w:pPr>
+      <w:pStyle w:val="Header"/>
+      <w:spacing w:after="0"/>
+      <w:jc w:val="right"/>
+    </w:pPr>
+    <w:r>
+      <w:rPr>
+        <w:rFonts w:ascii="Times New Roman" w:hAnsi="Times New Roman"/>
+        <w:sz w:val="24"/>
+      </w:rPr>
+      <w:fldChar w:fldCharType="begin"/>
+      <w:instrText xml:space="preserve"> PAGE </w:instrText>
+      <w:fldChar w:fldCharType="end"/>
+    </w:r>
+  </w:p>
+</w:hdr>
 </file>
 
 <file path=word/numbering.xml><?xml version="1.0" encoding="utf-8"?>
@@ -1789,6 +3456,7 @@
       <w:rFonts w:asciiTheme="majorHAnsi" w:eastAsiaTheme="majorEastAsia" w:hAnsiTheme="majorHAnsi" w:cstheme="majorBidi" w:ascii="Times New Roman" w:hAnsi="Times New Roman"/>
       <w:b/>
       <w:bCs/>
+      <w:i/>
       <w:color w:val="000000"/>
       <w:sz w:val="24"/>
     </w:rPr>

</xml_diff>

<commit_message>
Improve research paper and presentation quality
- Add author name (Edward Griggs), CNU, and COVACCI affiliation
- Add APA 7th page numbers, fix Heading 3 italic, fix figure captions
- Add comparison tables for detection techniques and prevention strategies
- Strengthen in-text citations across Risks, Detection, and Discussion
- Rewrite Discussion with flowing analysis instead of formulaic structure
- Enhance Conclusion with specific future direction citations
- Add slide numbers, stat callout (#1 OWASP), severity color coding
- Split detection into two slides, add Questions slide (15 total)
- Shorten slide bullets with accent-colored labels for readability
- Add figure annotations and tradeoff callouts on detection slides
</commit_message>
<xml_diff>
--- a/output/research_paper.docx
+++ b/output/research_paper.docx
@@ -31,7 +31,7 @@
           <w:rFonts w:ascii="Times New Roman" w:hAnsi="Times New Roman"/>
           <w:sz w:val="24"/>
         </w:rPr>
-        <w:t>Edward</w:t>
+        <w:t>Edward Griggs</w:t>
       </w:r>
     </w:p>
     <w:p>
@@ -43,7 +43,7 @@
           <w:rFonts w:ascii="Times New Roman" w:hAnsi="Times New Roman"/>
           <w:sz w:val="24"/>
         </w:rPr>
-        <w:t>Cybersecurity Research Division</w:t>
+        <w:t>COVACCI Cybersecurity Undergraduate Research</w:t>
       </w:r>
     </w:p>
     <w:p>
@@ -55,7 +55,7 @@
           <w:rFonts w:ascii="Times New Roman" w:hAnsi="Times New Roman"/>
           <w:sz w:val="24"/>
         </w:rPr>
-        <w:t>Commonwealth Cyber Initiative</w:t>
+        <w:t>Christopher Newport University</w:t>
       </w:r>
     </w:p>
     <w:p>

</xml_diff>